<commit_message>
fix(docx): exclude '<w:bCs>' from bold detection (#4366)
* fix(docx): exclude <w:bCs> from bold detection in _get_format_from_run

Signed-off-by: Cesar Berrospi Ramis <ceb@zurich.ibm.com>

* test(docx): add 'w:bCs' style edge case

Signed-off-by: Cesar Berrospi Ramis <ceb@zurich.ibm.com>

---------

Signed-off-by: Cesar Berrospi Ramis <ceb@zurich.ibm.com>
</commit_message>
<xml_diff>
--- a/tests/data/docx/sources/unit_test_formatting.docx
+++ b/tests/data/docx/sources/unit_test_formatting.docx
@@ -1,6 +1,6 @@
 
 <file path=word/document.xml><?xml version="1.0" encoding="utf-8"?>
-<w:document xmlns:wpc="http://schemas.microsoft.com/office/word/2010/wordprocessingCanvas" xmlns:cx="http://schemas.microsoft.com/office/drawing/2014/chartex" xmlns:cx1="http://schemas.microsoft.com/office/drawing/2015/9/8/chartex" xmlns:cx2="http://schemas.microsoft.com/office/drawing/2015/10/21/chartex" xmlns:cx3="http://schemas.microsoft.com/office/drawing/2016/5/9/chartex" xmlns:cx4="http://schemas.microsoft.com/office/drawing/2016/5/10/chartex" xmlns:cx5="http://schemas.microsoft.com/office/drawing/2016/5/11/chartex" xmlns:cx6="http://schemas.microsoft.com/office/drawing/2016/5/12/chartex" xmlns:cx7="http://schemas.microsoft.com/office/drawing/2016/5/13/chartex" xmlns:cx8="http://schemas.microsoft.com/office/drawing/2016/5/14/chartex" xmlns:mc="http://schemas.openxmlformats.org/markup-compatibility/2006" xmlns:aink="http://schemas.microsoft.com/office/drawing/2016/ink" xmlns:am3d="http://schemas.microsoft.com/office/drawing/2017/model3d" xmlns:o="urn:schemas-microsoft-com:office:office" xmlns:oel="http://schemas.microsoft.com/office/2019/extlst" xmlns:r="http://schemas.openxmlformats.org/officeDocument/2006/relationships" xmlns:m="http://schemas.openxmlformats.org/officeDocument/2006/math" xmlns:v="urn:schemas-microsoft-com:vml" xmlns:wp14="http://schemas.microsoft.com/office/word/2010/wordprocessingDrawing" xmlns:wp="http://schemas.openxmlformats.org/drawingml/2006/wordprocessingDrawing" xmlns:w10="urn:schemas-microsoft-com:office:word" xmlns:w="http://schemas.openxmlformats.org/wordprocessingml/2006/main" xmlns:w14="http://schemas.microsoft.com/office/word/2010/wordml" xmlns:w15="http://schemas.microsoft.com/office/word/2012/wordml" xmlns:w16cex="http://schemas.microsoft.com/office/word/2018/wordml/cex" xmlns:w16cid="http://schemas.microsoft.com/office/word/2016/wordml/cid" xmlns:w16="http://schemas.microsoft.com/office/word/2018/wordml" xmlns:w16du="http://schemas.microsoft.com/office/word/2023/wordml/word16du" xmlns:w16sdtdh="http://schemas.microsoft.com/office/word/2020/wordml/sdtdatahash" xmlns:w16sdtfl="http://schemas.microsoft.com/office/word/2024/wordml/sdtformatlock" xmlns:w16se="http://schemas.microsoft.com/office/word/2015/wordml/symex" xmlns:wpg="http://schemas.microsoft.com/office/word/2010/wordprocessingGroup" xmlns:wpi="http://schemas.microsoft.com/office/word/2010/wordprocessingInk" xmlns:wne="http://schemas.microsoft.com/office/word/2006/wordml" xmlns:wps="http://schemas.microsoft.com/office/word/2010/wordprocessingShape" mc:Ignorable="w14 w15 w16se w16cid w16 w16cex w16sdtdh w16sdtfl w16du wp14">
+<w:document xmlns:wpc="http://schemas.microsoft.com/office/word/2010/wordprocessingCanvas" xmlns:cx="http://schemas.microsoft.com/office/drawing/2014/chartex" xmlns:cx1="http://schemas.microsoft.com/office/drawing/2015/9/8/chartex" xmlns:cx2="http://schemas.microsoft.com/office/drawing/2015/10/21/chartex" xmlns:cx3="http://schemas.microsoft.com/office/drawing/2016/5/9/chartex" xmlns:cx4="http://schemas.microsoft.com/office/drawing/2016/5/10/chartex" xmlns:cx5="http://schemas.microsoft.com/office/drawing/2016/5/11/chartex" xmlns:cx6="http://schemas.microsoft.com/office/drawing/2016/5/12/chartex" xmlns:cx7="http://schemas.microsoft.com/office/drawing/2016/5/13/chartex" xmlns:cx8="http://schemas.microsoft.com/office/drawing/2016/5/14/chartex" xmlns:mc="http://schemas.openxmlformats.org/markup-compatibility/2006" xmlns:m="http://schemas.openxmlformats.org/officeDocument/2006/math" xmlns:aink="http://schemas.microsoft.com/office/drawing/2016/ink" xmlns:am3d="http://schemas.microsoft.com/office/drawing/2017/model3d" xmlns:oel="http://schemas.microsoft.com/office/2019/extlst" xmlns:r="http://schemas.openxmlformats.org/officeDocument/2006/relationships" xmlns:wp14="http://schemas.microsoft.com/office/word/2010/wordprocessingDrawing" xmlns:wp="http://schemas.openxmlformats.org/drawingml/2006/wordprocessingDrawing" xmlns:wpg="http://schemas.microsoft.com/office/word/2010/wordprocessingGroup" xmlns:wpi="http://schemas.microsoft.com/office/word/2010/wordprocessingInk" xmlns:wps="http://schemas.microsoft.com/office/word/2010/wordprocessingShape" xmlns:o="urn:schemas-microsoft-com:office:office" xmlns:v="urn:schemas-microsoft-com:vml" xmlns:w10="urn:schemas-microsoft-com:office:word" xmlns:w="http://schemas.openxmlformats.org/wordprocessingml/2006/main" xmlns:w14="http://schemas.microsoft.com/office/word/2010/wordml" xmlns:w15="http://schemas.microsoft.com/office/word/2012/wordml" xmlns:w16cex="http://schemas.microsoft.com/office/word/2018/wordml/cex" xmlns:w16cid="http://schemas.microsoft.com/office/word/2016/wordml/cid" xmlns:w16="http://schemas.microsoft.com/office/word/2018/wordml" xmlns:w16sdtdh="http://schemas.microsoft.com/office/word/2020/wordml/sdtdatahash" xmlns:w16sdtfl="http://schemas.microsoft.com/office/word/2024/wordml/sdtformatlock" xmlns:w16se="http://schemas.microsoft.com/office/word/2015/wordml/symex" xmlns:w16du="http://schemas.microsoft.com/office/word/2023/wordml/word16du" xmlns:wne="http://schemas.microsoft.com/office/word/2006/wordml" mc:Ignorable="w14 w15 w16se w16cid w16 w16cex w16sdtdh w16sdtfl w16du wp14">
   <w:body>
     <w:p>
       <w:pPr>
@@ -449,6 +449,115 @@
           <w:color w:val="auto"/>
           <w:lang w:val="en-US"/>
         </w:rPr>
+      </w:pPr>
+    </w:p>
+    <w:p>
+      <w:pPr>
+        <w:rPr>
+          <w:rStyle w:val="SubtleEmphasis"/>
+          <w:i w:val="0"/>
+          <w:iCs w:val="0"/>
+          <w:color w:val="auto"/>
+          <w:lang w:val="en-US"/>
+        </w:rPr>
+      </w:pPr>
+    </w:p>
+    <w:p>
+      <w:pPr>
+        <w:rPr>
+          <w:rStyle w:val="SubtleEmphasis"/>
+          <w:i w:val="0"/>
+          <w:iCs w:val="0"/>
+          <w:color w:val="auto"/>
+          <w:lang w:val="en-US"/>
+        </w:rPr>
+      </w:pPr>
+    </w:p>
+    <w:p>
+      <w:pPr>
+        <w:rPr>
+          <w:rFonts w:ascii="Times New Roman" w:eastAsia="Times New Roman" w:hAnsi="Times New Roman" w:cs="Times New Roman"/>
+          <w:b/>
+          <w:bCs/>
+          <w:kern w:val="0"/>
+          <w:sz w:val="18"/>
+          <w:szCs w:val="18"/>
+          <w:lang w:val="en-AU" w:eastAsia="en-AU"/>
+          <w14:ligatures w14:val="none"/>
+        </w:rPr>
+      </w:pPr>
+      <w:r>
+        <w:rPr>
+          <w:rFonts w:ascii="Times New Roman" w:eastAsia="Helvetica" w:hAnsi="Times New Roman" w:cs="Times New Roman"/>
+          <w:b/>
+          <w:kern w:val="0"/>
+          <w:sz w:val="18"/>
+          <w:lang w:val="en-AU" w:eastAsia="en-AU"/>
+          <w14:ligatures w14:val="none"/>
+        </w:rPr>
+        <w:t>Indexation</w:t>
+      </w:r>
+    </w:p>
+    <w:p>
+      <w:pPr>
+        <w:rPr>
+          <w:rFonts w:ascii="Times New Roman" w:eastAsia="Times New Roman" w:hAnsi="Times New Roman" w:cs="Times New Roman"/>
+          <w:bCs/>
+          <w:kern w:val="0"/>
+          <w:sz w:val="18"/>
+          <w:szCs w:val="18"/>
+          <w:lang w:val="en-AU" w:eastAsia="en-AU"/>
+          <w14:ligatures w14:val="none"/>
+        </w:rPr>
+      </w:pPr>
+      <w:r>
+        <w:rPr>
+          <w:rFonts w:ascii="Times New Roman" w:eastAsia="Times New Roman" w:hAnsi="Times New Roman" w:cs="Times New Roman"/>
+          <w:bCs/>
+          <w:kern w:val="0"/>
+          <w:sz w:val="18"/>
+          <w:szCs w:val="18"/>
+          <w:lang w:val="en-AU" w:eastAsia="en-AU"/>
+          <w14:ligatures w14:val="none"/>
+        </w:rPr>
+        <w:t xml:space="preserve">This text carries a </w:t>
+      </w:r>
+      <w:r>
+        <w:rPr>
+          <w:rFonts w:ascii="Times New Roman" w:eastAsia="Times New Roman" w:hAnsi="Times New Roman" w:cs="Times New Roman"/>
+          <w:bCs/>
+          <w:i/>
+          <w:iCs/>
+          <w:kern w:val="0"/>
+          <w:sz w:val="18"/>
+          <w:szCs w:val="18"/>
+          <w:lang w:val="en-AU" w:eastAsia="en-AU"/>
+          <w14:ligatures w14:val="none"/>
+        </w:rPr>
+        <w:t>complex-script bold</w:t>
+      </w:r>
+      <w:r>
+        <w:rPr>
+          <w:rFonts w:ascii="Times New Roman" w:eastAsia="Times New Roman" w:hAnsi="Times New Roman" w:cs="Times New Roman"/>
+          <w:bCs/>
+          <w:kern w:val="0"/>
+          <w:sz w:val="18"/>
+          <w:szCs w:val="18"/>
+          <w:lang w:val="en-AU" w:eastAsia="en-AU"/>
+          <w14:ligatures w14:val="none"/>
+        </w:rPr>
+        <w:t xml:space="preserve"> property in OOXML but it should not be bold.</w:t>
+      </w:r>
+    </w:p>
+    <w:p>
+      <w:pPr>
+        <w:rPr>
+          <w:rStyle w:val="SubtleEmphasis"/>
+          <w:i w:val="0"/>
+          <w:iCs w:val="0"/>
+          <w:color w:val="auto"/>
+          <w:lang w:val="en-US"/>
+        </w:rPr>
         <w:sectPr>
           <w:headerReference w:type="even" r:id="rId10"/>
           <w:headerReference w:type="default" r:id="rId11"/>
@@ -536,7 +645,7 @@
 </file>
 
 <file path=word/endnotes.xml><?xml version="1.0" encoding="utf-8"?>
-<w:endnotes xmlns:wpc="http://schemas.microsoft.com/office/word/2010/wordprocessingCanvas" xmlns:cx="http://schemas.microsoft.com/office/drawing/2014/chartex" xmlns:cx1="http://schemas.microsoft.com/office/drawing/2015/9/8/chartex" xmlns:cx2="http://schemas.microsoft.com/office/drawing/2015/10/21/chartex" xmlns:cx3="http://schemas.microsoft.com/office/drawing/2016/5/9/chartex" xmlns:cx4="http://schemas.microsoft.com/office/drawing/2016/5/10/chartex" xmlns:cx5="http://schemas.microsoft.com/office/drawing/2016/5/11/chartex" xmlns:cx6="http://schemas.microsoft.com/office/drawing/2016/5/12/chartex" xmlns:cx7="http://schemas.microsoft.com/office/drawing/2016/5/13/chartex" xmlns:cx8="http://schemas.microsoft.com/office/drawing/2016/5/14/chartex" xmlns:mc="http://schemas.openxmlformats.org/markup-compatibility/2006" xmlns:aink="http://schemas.microsoft.com/office/drawing/2016/ink" xmlns:am3d="http://schemas.microsoft.com/office/drawing/2017/model3d" xmlns:o="urn:schemas-microsoft-com:office:office" xmlns:oel="http://schemas.microsoft.com/office/2019/extlst" xmlns:r="http://schemas.openxmlformats.org/officeDocument/2006/relationships" xmlns:m="http://schemas.openxmlformats.org/officeDocument/2006/math" xmlns:v="urn:schemas-microsoft-com:vml" xmlns:wp14="http://schemas.microsoft.com/office/word/2010/wordprocessingDrawing" xmlns:wp="http://schemas.openxmlformats.org/drawingml/2006/wordprocessingDrawing" xmlns:w10="urn:schemas-microsoft-com:office:word" xmlns:w="http://schemas.openxmlformats.org/wordprocessingml/2006/main" xmlns:w14="http://schemas.microsoft.com/office/word/2010/wordml" xmlns:w15="http://schemas.microsoft.com/office/word/2012/wordml" xmlns:w16cex="http://schemas.microsoft.com/office/word/2018/wordml/cex" xmlns:w16cid="http://schemas.microsoft.com/office/word/2016/wordml/cid" xmlns:w16="http://schemas.microsoft.com/office/word/2018/wordml" xmlns:w16du="http://schemas.microsoft.com/office/word/2023/wordml/word16du" xmlns:w16sdtdh="http://schemas.microsoft.com/office/word/2020/wordml/sdtdatahash" xmlns:w16sdtfl="http://schemas.microsoft.com/office/word/2024/wordml/sdtformatlock" xmlns:w16se="http://schemas.microsoft.com/office/word/2015/wordml/symex" xmlns:wpg="http://schemas.microsoft.com/office/word/2010/wordprocessingGroup" xmlns:wpi="http://schemas.microsoft.com/office/word/2010/wordprocessingInk" xmlns:wne="http://schemas.microsoft.com/office/word/2006/wordml" xmlns:wps="http://schemas.microsoft.com/office/word/2010/wordprocessingShape" mc:Ignorable="w14 w15 w16se w16cid w16 w16cex w16sdtdh w16sdtfl w16du wp14">
+<w:endnotes xmlns:wpc="http://schemas.microsoft.com/office/word/2010/wordprocessingCanvas" xmlns:cx="http://schemas.microsoft.com/office/drawing/2014/chartex" xmlns:cx1="http://schemas.microsoft.com/office/drawing/2015/9/8/chartex" xmlns:cx2="http://schemas.microsoft.com/office/drawing/2015/10/21/chartex" xmlns:cx3="http://schemas.microsoft.com/office/drawing/2016/5/9/chartex" xmlns:cx4="http://schemas.microsoft.com/office/drawing/2016/5/10/chartex" xmlns:cx5="http://schemas.microsoft.com/office/drawing/2016/5/11/chartex" xmlns:cx6="http://schemas.microsoft.com/office/drawing/2016/5/12/chartex" xmlns:cx7="http://schemas.microsoft.com/office/drawing/2016/5/13/chartex" xmlns:cx8="http://schemas.microsoft.com/office/drawing/2016/5/14/chartex" xmlns:mc="http://schemas.openxmlformats.org/markup-compatibility/2006" xmlns:m="http://schemas.openxmlformats.org/officeDocument/2006/math" xmlns:aink="http://schemas.microsoft.com/office/drawing/2016/ink" xmlns:am3d="http://schemas.microsoft.com/office/drawing/2017/model3d" xmlns:oel="http://schemas.microsoft.com/office/2019/extlst" xmlns:r="http://schemas.openxmlformats.org/officeDocument/2006/relationships" xmlns:wp14="http://schemas.microsoft.com/office/word/2010/wordprocessingDrawing" xmlns:wp="http://schemas.openxmlformats.org/drawingml/2006/wordprocessingDrawing" xmlns:wpg="http://schemas.microsoft.com/office/word/2010/wordprocessingGroup" xmlns:wpi="http://schemas.microsoft.com/office/word/2010/wordprocessingInk" xmlns:wps="http://schemas.microsoft.com/office/word/2010/wordprocessingShape" xmlns:o="urn:schemas-microsoft-com:office:office" xmlns:v="urn:schemas-microsoft-com:vml" xmlns:w10="urn:schemas-microsoft-com:office:word" xmlns:w="http://schemas.openxmlformats.org/wordprocessingml/2006/main" xmlns:w14="http://schemas.microsoft.com/office/word/2010/wordml" xmlns:w15="http://schemas.microsoft.com/office/word/2012/wordml" xmlns:w16cex="http://schemas.microsoft.com/office/word/2018/wordml/cex" xmlns:w16cid="http://schemas.microsoft.com/office/word/2016/wordml/cid" xmlns:w16="http://schemas.microsoft.com/office/word/2018/wordml" xmlns:w16sdtdh="http://schemas.microsoft.com/office/word/2020/wordml/sdtdatahash" xmlns:w16sdtfl="http://schemas.microsoft.com/office/word/2024/wordml/sdtformatlock" xmlns:w16se="http://schemas.microsoft.com/office/word/2015/wordml/symex" xmlns:w16du="http://schemas.microsoft.com/office/word/2023/wordml/word16du" xmlns:wne="http://schemas.microsoft.com/office/word/2006/wordml" mc:Ignorable="w14 w15 w16se w16cid w16 w16cex w16sdtdh w16sdtfl w16du wp14">
   <w:endnote w:type="separator" w:id="-1">
     <w:p>
       <w:r>
@@ -555,7 +664,7 @@
 </file>
 
 <file path=word/footer1.xml><?xml version="1.0" encoding="utf-8"?>
-<w:ftr xmlns:wpc="http://schemas.microsoft.com/office/word/2010/wordprocessingCanvas" xmlns:cx="http://schemas.microsoft.com/office/drawing/2014/chartex" xmlns:cx1="http://schemas.microsoft.com/office/drawing/2015/9/8/chartex" xmlns:cx2="http://schemas.microsoft.com/office/drawing/2015/10/21/chartex" xmlns:cx3="http://schemas.microsoft.com/office/drawing/2016/5/9/chartex" xmlns:cx4="http://schemas.microsoft.com/office/drawing/2016/5/10/chartex" xmlns:cx5="http://schemas.microsoft.com/office/drawing/2016/5/11/chartex" xmlns:cx6="http://schemas.microsoft.com/office/drawing/2016/5/12/chartex" xmlns:cx7="http://schemas.microsoft.com/office/drawing/2016/5/13/chartex" xmlns:cx8="http://schemas.microsoft.com/office/drawing/2016/5/14/chartex" xmlns:mc="http://schemas.openxmlformats.org/markup-compatibility/2006" xmlns:aink="http://schemas.microsoft.com/office/drawing/2016/ink" xmlns:am3d="http://schemas.microsoft.com/office/drawing/2017/model3d" xmlns:o="urn:schemas-microsoft-com:office:office" xmlns:oel="http://schemas.microsoft.com/office/2019/extlst" xmlns:r="http://schemas.openxmlformats.org/officeDocument/2006/relationships" xmlns:m="http://schemas.openxmlformats.org/officeDocument/2006/math" xmlns:v="urn:schemas-microsoft-com:vml" xmlns:wp14="http://schemas.microsoft.com/office/word/2010/wordprocessingDrawing" xmlns:wp="http://schemas.openxmlformats.org/drawingml/2006/wordprocessingDrawing" xmlns:w10="urn:schemas-microsoft-com:office:word" xmlns:w="http://schemas.openxmlformats.org/wordprocessingml/2006/main" xmlns:w14="http://schemas.microsoft.com/office/word/2010/wordml" xmlns:w15="http://schemas.microsoft.com/office/word/2012/wordml" xmlns:w16cex="http://schemas.microsoft.com/office/word/2018/wordml/cex" xmlns:w16cid="http://schemas.microsoft.com/office/word/2016/wordml/cid" xmlns:w16="http://schemas.microsoft.com/office/word/2018/wordml" xmlns:w16du="http://schemas.microsoft.com/office/word/2023/wordml/word16du" xmlns:w16sdtdh="http://schemas.microsoft.com/office/word/2020/wordml/sdtdatahash" xmlns:w16sdtfl="http://schemas.microsoft.com/office/word/2024/wordml/sdtformatlock" xmlns:w16se="http://schemas.microsoft.com/office/word/2015/wordml/symex" xmlns:wpg="http://schemas.microsoft.com/office/word/2010/wordprocessingGroup" xmlns:wpi="http://schemas.microsoft.com/office/word/2010/wordprocessingInk" xmlns:wne="http://schemas.microsoft.com/office/word/2006/wordml" xmlns:wps="http://schemas.microsoft.com/office/word/2010/wordprocessingShape" mc:Ignorable="w14 w15 w16se w16cid w16 w16cex w16sdtdh w16sdtfl w16du wp14">
+<w:ftr xmlns:wpc="http://schemas.microsoft.com/office/word/2010/wordprocessingCanvas" xmlns:cx="http://schemas.microsoft.com/office/drawing/2014/chartex" xmlns:cx1="http://schemas.microsoft.com/office/drawing/2015/9/8/chartex" xmlns:cx2="http://schemas.microsoft.com/office/drawing/2015/10/21/chartex" xmlns:cx3="http://schemas.microsoft.com/office/drawing/2016/5/9/chartex" xmlns:cx4="http://schemas.microsoft.com/office/drawing/2016/5/10/chartex" xmlns:cx5="http://schemas.microsoft.com/office/drawing/2016/5/11/chartex" xmlns:cx6="http://schemas.microsoft.com/office/drawing/2016/5/12/chartex" xmlns:cx7="http://schemas.microsoft.com/office/drawing/2016/5/13/chartex" xmlns:cx8="http://schemas.microsoft.com/office/drawing/2016/5/14/chartex" xmlns:mc="http://schemas.openxmlformats.org/markup-compatibility/2006" xmlns:m="http://schemas.openxmlformats.org/officeDocument/2006/math" xmlns:aink="http://schemas.microsoft.com/office/drawing/2016/ink" xmlns:am3d="http://schemas.microsoft.com/office/drawing/2017/model3d" xmlns:oel="http://schemas.microsoft.com/office/2019/extlst" xmlns:r="http://schemas.openxmlformats.org/officeDocument/2006/relationships" xmlns:wp14="http://schemas.microsoft.com/office/word/2010/wordprocessingDrawing" xmlns:wp="http://schemas.openxmlformats.org/drawingml/2006/wordprocessingDrawing" xmlns:wpg="http://schemas.microsoft.com/office/word/2010/wordprocessingGroup" xmlns:wpi="http://schemas.microsoft.com/office/word/2010/wordprocessingInk" xmlns:wps="http://schemas.microsoft.com/office/word/2010/wordprocessingShape" xmlns:o="urn:schemas-microsoft-com:office:office" xmlns:v="urn:schemas-microsoft-com:vml" xmlns:w10="urn:schemas-microsoft-com:office:word" xmlns:w="http://schemas.openxmlformats.org/wordprocessingml/2006/main" xmlns:w14="http://schemas.microsoft.com/office/word/2010/wordml" xmlns:w15="http://schemas.microsoft.com/office/word/2012/wordml" xmlns:w16cex="http://schemas.microsoft.com/office/word/2018/wordml/cex" xmlns:w16cid="http://schemas.microsoft.com/office/word/2016/wordml/cid" xmlns:w16="http://schemas.microsoft.com/office/word/2018/wordml" xmlns:w16sdtdh="http://schemas.microsoft.com/office/word/2020/wordml/sdtdatahash" xmlns:w16sdtfl="http://schemas.microsoft.com/office/word/2024/wordml/sdtformatlock" xmlns:w16se="http://schemas.microsoft.com/office/word/2015/wordml/symex" xmlns:w16du="http://schemas.microsoft.com/office/word/2023/wordml/word16du" xmlns:wne="http://schemas.microsoft.com/office/word/2006/wordml" mc:Ignorable="w14 w15 w16se w16cid w16 w16cex w16sdtdh w16sdtfl w16du wp14">
   <w:p>
     <w:pPr>
       <w:pStyle w:val="Footer"/>
@@ -565,20 +674,33 @@
 </file>
 
 <file path=word/footer2.xml><?xml version="1.0" encoding="utf-8"?>
-<w:ftr xmlns:wpc="http://schemas.microsoft.com/office/word/2010/wordprocessingCanvas" xmlns:cx="http://schemas.microsoft.com/office/drawing/2014/chartex" xmlns:cx1="http://schemas.microsoft.com/office/drawing/2015/9/8/chartex" xmlns:cx2="http://schemas.microsoft.com/office/drawing/2015/10/21/chartex" xmlns:cx3="http://schemas.microsoft.com/office/drawing/2016/5/9/chartex" xmlns:cx4="http://schemas.microsoft.com/office/drawing/2016/5/10/chartex" xmlns:cx5="http://schemas.microsoft.com/office/drawing/2016/5/11/chartex" xmlns:cx6="http://schemas.microsoft.com/office/drawing/2016/5/12/chartex" xmlns:cx7="http://schemas.microsoft.com/office/drawing/2016/5/13/chartex" xmlns:cx8="http://schemas.microsoft.com/office/drawing/2016/5/14/chartex" xmlns:mc="http://schemas.openxmlformats.org/markup-compatibility/2006" xmlns:aink="http://schemas.microsoft.com/office/drawing/2016/ink" xmlns:am3d="http://schemas.microsoft.com/office/drawing/2017/model3d" xmlns:o="urn:schemas-microsoft-com:office:office" xmlns:oel="http://schemas.microsoft.com/office/2019/extlst" xmlns:r="http://schemas.openxmlformats.org/officeDocument/2006/relationships" xmlns:m="http://schemas.openxmlformats.org/officeDocument/2006/math" xmlns:v="urn:schemas-microsoft-com:vml" xmlns:wp14="http://schemas.microsoft.com/office/word/2010/wordprocessingDrawing" xmlns:wp="http://schemas.openxmlformats.org/drawingml/2006/wordprocessingDrawing" xmlns:w10="urn:schemas-microsoft-com:office:word" xmlns:w="http://schemas.openxmlformats.org/wordprocessingml/2006/main" xmlns:w14="http://schemas.microsoft.com/office/word/2010/wordml" xmlns:w15="http://schemas.microsoft.com/office/word/2012/wordml" xmlns:w16cex="http://schemas.microsoft.com/office/word/2018/wordml/cex" xmlns:w16cid="http://schemas.microsoft.com/office/word/2016/wordml/cid" xmlns:w16="http://schemas.microsoft.com/office/word/2018/wordml" xmlns:w16du="http://schemas.microsoft.com/office/word/2023/wordml/word16du" xmlns:w16sdtdh="http://schemas.microsoft.com/office/word/2020/wordml/sdtdatahash" xmlns:w16sdtfl="http://schemas.microsoft.com/office/word/2024/wordml/sdtformatlock" xmlns:w16se="http://schemas.microsoft.com/office/word/2015/wordml/symex" xmlns:wpg="http://schemas.microsoft.com/office/word/2010/wordprocessingGroup" xmlns:wpi="http://schemas.microsoft.com/office/word/2010/wordprocessingInk" xmlns:wne="http://schemas.microsoft.com/office/word/2006/wordml" xmlns:wps="http://schemas.microsoft.com/office/word/2010/wordprocessingShape" mc:Ignorable="w14 w15 w16se w16cid w16 w16cex w16sdtdh w16sdtfl w16du wp14">
+<w:ftr xmlns:wpc="http://schemas.microsoft.com/office/word/2010/wordprocessingCanvas" xmlns:cx="http://schemas.microsoft.com/office/drawing/2014/chartex" xmlns:cx1="http://schemas.microsoft.com/office/drawing/2015/9/8/chartex" xmlns:cx2="http://schemas.microsoft.com/office/drawing/2015/10/21/chartex" xmlns:cx3="http://schemas.microsoft.com/office/drawing/2016/5/9/chartex" xmlns:cx4="http://schemas.microsoft.com/office/drawing/2016/5/10/chartex" xmlns:cx5="http://schemas.microsoft.com/office/drawing/2016/5/11/chartex" xmlns:cx6="http://schemas.microsoft.com/office/drawing/2016/5/12/chartex" xmlns:cx7="http://schemas.microsoft.com/office/drawing/2016/5/13/chartex" xmlns:cx8="http://schemas.microsoft.com/office/drawing/2016/5/14/chartex" xmlns:mc="http://schemas.openxmlformats.org/markup-compatibility/2006" xmlns:m="http://schemas.openxmlformats.org/officeDocument/2006/math" xmlns:aink="http://schemas.microsoft.com/office/drawing/2016/ink" xmlns:am3d="http://schemas.microsoft.com/office/drawing/2017/model3d" xmlns:oel="http://schemas.microsoft.com/office/2019/extlst" xmlns:r="http://schemas.openxmlformats.org/officeDocument/2006/relationships" xmlns:wp14="http://schemas.microsoft.com/office/word/2010/wordprocessingDrawing" xmlns:wp="http://schemas.openxmlformats.org/drawingml/2006/wordprocessingDrawing" xmlns:wpg="http://schemas.microsoft.com/office/word/2010/wordprocessingGroup" xmlns:wpi="http://schemas.microsoft.com/office/word/2010/wordprocessingInk" xmlns:wps="http://schemas.microsoft.com/office/word/2010/wordprocessingShape" xmlns:o="urn:schemas-microsoft-com:office:office" xmlns:v="urn:schemas-microsoft-com:vml" xmlns:w10="urn:schemas-microsoft-com:office:word" xmlns:w="http://schemas.openxmlformats.org/wordprocessingml/2006/main" xmlns:w14="http://schemas.microsoft.com/office/word/2010/wordml" xmlns:w15="http://schemas.microsoft.com/office/word/2012/wordml" xmlns:w16cex="http://schemas.microsoft.com/office/word/2018/wordml/cex" xmlns:w16cid="http://schemas.microsoft.com/office/word/2016/wordml/cid" xmlns:w16="http://schemas.microsoft.com/office/word/2018/wordml" xmlns:w16sdtdh="http://schemas.microsoft.com/office/word/2020/wordml/sdtdatahash" xmlns:w16sdtfl="http://schemas.microsoft.com/office/word/2024/wordml/sdtformatlock" xmlns:w16se="http://schemas.microsoft.com/office/word/2015/wordml/symex" xmlns:w16du="http://schemas.microsoft.com/office/word/2023/wordml/word16du" xmlns:wne="http://schemas.microsoft.com/office/word/2006/wordml" mc:Ignorable="w14 w15 w16se w16cid w16 w16cex w16sdtdh w16sdtfl w16du wp14">
   <w:p>
     <w:pPr>
       <w:pStyle w:val="Footer"/>
     </w:pPr>
     <w:r>
-      <w:t>This is a footer</w:t>
+      <w:t xml:space="preserve">This </w:t>
     </w:r>
+    <w:proofErr w:type="spellStart"/>
+    <w:r>
+      <w:t>is</w:t>
+    </w:r>
+    <w:proofErr w:type="spellEnd"/>
+    <w:r>
+      <w:t xml:space="preserve"> a </w:t>
+    </w:r>
+    <w:proofErr w:type="spellStart"/>
+    <w:r>
+      <w:t>footer</w:t>
+    </w:r>
+    <w:proofErr w:type="spellEnd"/>
   </w:p>
 </w:ftr>
 </file>
 
 <file path=word/footer3.xml><?xml version="1.0" encoding="utf-8"?>
-<w:ftr xmlns:wpc="http://schemas.microsoft.com/office/word/2010/wordprocessingCanvas" xmlns:cx="http://schemas.microsoft.com/office/drawing/2014/chartex" xmlns:cx1="http://schemas.microsoft.com/office/drawing/2015/9/8/chartex" xmlns:cx2="http://schemas.microsoft.com/office/drawing/2015/10/21/chartex" xmlns:cx3="http://schemas.microsoft.com/office/drawing/2016/5/9/chartex" xmlns:cx4="http://schemas.microsoft.com/office/drawing/2016/5/10/chartex" xmlns:cx5="http://schemas.microsoft.com/office/drawing/2016/5/11/chartex" xmlns:cx6="http://schemas.microsoft.com/office/drawing/2016/5/12/chartex" xmlns:cx7="http://schemas.microsoft.com/office/drawing/2016/5/13/chartex" xmlns:cx8="http://schemas.microsoft.com/office/drawing/2016/5/14/chartex" xmlns:mc="http://schemas.openxmlformats.org/markup-compatibility/2006" xmlns:aink="http://schemas.microsoft.com/office/drawing/2016/ink" xmlns:am3d="http://schemas.microsoft.com/office/drawing/2017/model3d" xmlns:o="urn:schemas-microsoft-com:office:office" xmlns:oel="http://schemas.microsoft.com/office/2019/extlst" xmlns:r="http://schemas.openxmlformats.org/officeDocument/2006/relationships" xmlns:m="http://schemas.openxmlformats.org/officeDocument/2006/math" xmlns:v="urn:schemas-microsoft-com:vml" xmlns:wp14="http://schemas.microsoft.com/office/word/2010/wordprocessingDrawing" xmlns:wp="http://schemas.openxmlformats.org/drawingml/2006/wordprocessingDrawing" xmlns:w10="urn:schemas-microsoft-com:office:word" xmlns:w="http://schemas.openxmlformats.org/wordprocessingml/2006/main" xmlns:w14="http://schemas.microsoft.com/office/word/2010/wordml" xmlns:w15="http://schemas.microsoft.com/office/word/2012/wordml" xmlns:w16cex="http://schemas.microsoft.com/office/word/2018/wordml/cex" xmlns:w16cid="http://schemas.microsoft.com/office/word/2016/wordml/cid" xmlns:w16="http://schemas.microsoft.com/office/word/2018/wordml" xmlns:w16du="http://schemas.microsoft.com/office/word/2023/wordml/word16du" xmlns:w16sdtdh="http://schemas.microsoft.com/office/word/2020/wordml/sdtdatahash" xmlns:w16sdtfl="http://schemas.microsoft.com/office/word/2024/wordml/sdtformatlock" xmlns:w16se="http://schemas.microsoft.com/office/word/2015/wordml/symex" xmlns:wpg="http://schemas.microsoft.com/office/word/2010/wordprocessingGroup" xmlns:wpi="http://schemas.microsoft.com/office/word/2010/wordprocessingInk" xmlns:wne="http://schemas.microsoft.com/office/word/2006/wordml" xmlns:wps="http://schemas.microsoft.com/office/word/2010/wordprocessingShape" mc:Ignorable="w14 w15 w16se w16cid w16 w16cex w16sdtdh w16sdtfl w16du wp14">
+<w:ftr xmlns:wpc="http://schemas.microsoft.com/office/word/2010/wordprocessingCanvas" xmlns:cx="http://schemas.microsoft.com/office/drawing/2014/chartex" xmlns:cx1="http://schemas.microsoft.com/office/drawing/2015/9/8/chartex" xmlns:cx2="http://schemas.microsoft.com/office/drawing/2015/10/21/chartex" xmlns:cx3="http://schemas.microsoft.com/office/drawing/2016/5/9/chartex" xmlns:cx4="http://schemas.microsoft.com/office/drawing/2016/5/10/chartex" xmlns:cx5="http://schemas.microsoft.com/office/drawing/2016/5/11/chartex" xmlns:cx6="http://schemas.microsoft.com/office/drawing/2016/5/12/chartex" xmlns:cx7="http://schemas.microsoft.com/office/drawing/2016/5/13/chartex" xmlns:cx8="http://schemas.microsoft.com/office/drawing/2016/5/14/chartex" xmlns:mc="http://schemas.openxmlformats.org/markup-compatibility/2006" xmlns:m="http://schemas.openxmlformats.org/officeDocument/2006/math" xmlns:aink="http://schemas.microsoft.com/office/drawing/2016/ink" xmlns:am3d="http://schemas.microsoft.com/office/drawing/2017/model3d" xmlns:oel="http://schemas.microsoft.com/office/2019/extlst" xmlns:r="http://schemas.openxmlformats.org/officeDocument/2006/relationships" xmlns:wp14="http://schemas.microsoft.com/office/word/2010/wordprocessingDrawing" xmlns:wp="http://schemas.openxmlformats.org/drawingml/2006/wordprocessingDrawing" xmlns:wpg="http://schemas.microsoft.com/office/word/2010/wordprocessingGroup" xmlns:wpi="http://schemas.microsoft.com/office/word/2010/wordprocessingInk" xmlns:wps="http://schemas.microsoft.com/office/word/2010/wordprocessingShape" xmlns:o="urn:schemas-microsoft-com:office:office" xmlns:v="urn:schemas-microsoft-com:vml" xmlns:w10="urn:schemas-microsoft-com:office:word" xmlns:w="http://schemas.openxmlformats.org/wordprocessingml/2006/main" xmlns:w14="http://schemas.microsoft.com/office/word/2010/wordml" xmlns:w15="http://schemas.microsoft.com/office/word/2012/wordml" xmlns:w16cex="http://schemas.microsoft.com/office/word/2018/wordml/cex" xmlns:w16cid="http://schemas.microsoft.com/office/word/2016/wordml/cid" xmlns:w16="http://schemas.microsoft.com/office/word/2018/wordml" xmlns:w16sdtdh="http://schemas.microsoft.com/office/word/2020/wordml/sdtdatahash" xmlns:w16sdtfl="http://schemas.microsoft.com/office/word/2024/wordml/sdtformatlock" xmlns:w16se="http://schemas.microsoft.com/office/word/2015/wordml/symex" xmlns:w16du="http://schemas.microsoft.com/office/word/2023/wordml/word16du" xmlns:wne="http://schemas.microsoft.com/office/word/2006/wordml" mc:Ignorable="w14 w15 w16se w16cid w16 w16cex w16sdtdh w16sdtfl w16du wp14">
   <w:p>
     <w:pPr>
       <w:pStyle w:val="Footer"/>
@@ -648,6 +770,9 @@
       <w:fldChar w:fldCharType="begin"/>
     </w:r>
     <w:r>
+      <w:rPr>
+        <w:lang w:val="en-US"/>
+      </w:rPr>
       <w:instrText xml:space="preserve"> INCLUDEPICTURE "https://avatars.githubusercontent.com/u/188446108?s=48&amp;v=4" \* MERGEFORMATINET </w:instrText>
     </w:r>
     <w:r>
@@ -714,7 +839,7 @@
 </file>
 
 <file path=word/footnotes.xml><?xml version="1.0" encoding="utf-8"?>
-<w:footnotes xmlns:wpc="http://schemas.microsoft.com/office/word/2010/wordprocessingCanvas" xmlns:cx="http://schemas.microsoft.com/office/drawing/2014/chartex" xmlns:cx1="http://schemas.microsoft.com/office/drawing/2015/9/8/chartex" xmlns:cx2="http://schemas.microsoft.com/office/drawing/2015/10/21/chartex" xmlns:cx3="http://schemas.microsoft.com/office/drawing/2016/5/9/chartex" xmlns:cx4="http://schemas.microsoft.com/office/drawing/2016/5/10/chartex" xmlns:cx5="http://schemas.microsoft.com/office/drawing/2016/5/11/chartex" xmlns:cx6="http://schemas.microsoft.com/office/drawing/2016/5/12/chartex" xmlns:cx7="http://schemas.microsoft.com/office/drawing/2016/5/13/chartex" xmlns:cx8="http://schemas.microsoft.com/office/drawing/2016/5/14/chartex" xmlns:mc="http://schemas.openxmlformats.org/markup-compatibility/2006" xmlns:aink="http://schemas.microsoft.com/office/drawing/2016/ink" xmlns:am3d="http://schemas.microsoft.com/office/drawing/2017/model3d" xmlns:o="urn:schemas-microsoft-com:office:office" xmlns:oel="http://schemas.microsoft.com/office/2019/extlst" xmlns:r="http://schemas.openxmlformats.org/officeDocument/2006/relationships" xmlns:m="http://schemas.openxmlformats.org/officeDocument/2006/math" xmlns:v="urn:schemas-microsoft-com:vml" xmlns:wp14="http://schemas.microsoft.com/office/word/2010/wordprocessingDrawing" xmlns:wp="http://schemas.openxmlformats.org/drawingml/2006/wordprocessingDrawing" xmlns:w10="urn:schemas-microsoft-com:office:word" xmlns:w="http://schemas.openxmlformats.org/wordprocessingml/2006/main" xmlns:w14="http://schemas.microsoft.com/office/word/2010/wordml" xmlns:w15="http://schemas.microsoft.com/office/word/2012/wordml" xmlns:w16cex="http://schemas.microsoft.com/office/word/2018/wordml/cex" xmlns:w16cid="http://schemas.microsoft.com/office/word/2016/wordml/cid" xmlns:w16="http://schemas.microsoft.com/office/word/2018/wordml" xmlns:w16du="http://schemas.microsoft.com/office/word/2023/wordml/word16du" xmlns:w16sdtdh="http://schemas.microsoft.com/office/word/2020/wordml/sdtdatahash" xmlns:w16sdtfl="http://schemas.microsoft.com/office/word/2024/wordml/sdtformatlock" xmlns:w16se="http://schemas.microsoft.com/office/word/2015/wordml/symex" xmlns:wpg="http://schemas.microsoft.com/office/word/2010/wordprocessingGroup" xmlns:wpi="http://schemas.microsoft.com/office/word/2010/wordprocessingInk" xmlns:wne="http://schemas.microsoft.com/office/word/2006/wordml" xmlns:wps="http://schemas.microsoft.com/office/word/2010/wordprocessingShape" mc:Ignorable="w14 w15 w16se w16cid w16 w16cex w16sdtdh w16sdtfl w16du wp14">
+<w:footnotes xmlns:wpc="http://schemas.microsoft.com/office/word/2010/wordprocessingCanvas" xmlns:cx="http://schemas.microsoft.com/office/drawing/2014/chartex" xmlns:cx1="http://schemas.microsoft.com/office/drawing/2015/9/8/chartex" xmlns:cx2="http://schemas.microsoft.com/office/drawing/2015/10/21/chartex" xmlns:cx3="http://schemas.microsoft.com/office/drawing/2016/5/9/chartex" xmlns:cx4="http://schemas.microsoft.com/office/drawing/2016/5/10/chartex" xmlns:cx5="http://schemas.microsoft.com/office/drawing/2016/5/11/chartex" xmlns:cx6="http://schemas.microsoft.com/office/drawing/2016/5/12/chartex" xmlns:cx7="http://schemas.microsoft.com/office/drawing/2016/5/13/chartex" xmlns:cx8="http://schemas.microsoft.com/office/drawing/2016/5/14/chartex" xmlns:mc="http://schemas.openxmlformats.org/markup-compatibility/2006" xmlns:m="http://schemas.openxmlformats.org/officeDocument/2006/math" xmlns:aink="http://schemas.microsoft.com/office/drawing/2016/ink" xmlns:am3d="http://schemas.microsoft.com/office/drawing/2017/model3d" xmlns:oel="http://schemas.microsoft.com/office/2019/extlst" xmlns:r="http://schemas.openxmlformats.org/officeDocument/2006/relationships" xmlns:wp14="http://schemas.microsoft.com/office/word/2010/wordprocessingDrawing" xmlns:wp="http://schemas.openxmlformats.org/drawingml/2006/wordprocessingDrawing" xmlns:wpg="http://schemas.microsoft.com/office/word/2010/wordprocessingGroup" xmlns:wpi="http://schemas.microsoft.com/office/word/2010/wordprocessingInk" xmlns:wps="http://schemas.microsoft.com/office/word/2010/wordprocessingShape" xmlns:o="urn:schemas-microsoft-com:office:office" xmlns:v="urn:schemas-microsoft-com:vml" xmlns:w10="urn:schemas-microsoft-com:office:word" xmlns:w="http://schemas.openxmlformats.org/wordprocessingml/2006/main" xmlns:w14="http://schemas.microsoft.com/office/word/2010/wordml" xmlns:w15="http://schemas.microsoft.com/office/word/2012/wordml" xmlns:w16cex="http://schemas.microsoft.com/office/word/2018/wordml/cex" xmlns:w16cid="http://schemas.microsoft.com/office/word/2016/wordml/cid" xmlns:w16="http://schemas.microsoft.com/office/word/2018/wordml" xmlns:w16sdtdh="http://schemas.microsoft.com/office/word/2020/wordml/sdtdatahash" xmlns:w16sdtfl="http://schemas.microsoft.com/office/word/2024/wordml/sdtformatlock" xmlns:w16se="http://schemas.microsoft.com/office/word/2015/wordml/symex" xmlns:w16du="http://schemas.microsoft.com/office/word/2023/wordml/word16du" xmlns:wne="http://schemas.microsoft.com/office/word/2006/wordml" mc:Ignorable="w14 w15 w16se w16cid w16 w16cex w16sdtdh w16sdtfl w16du wp14">
   <w:footnote w:type="separator" w:id="-1">
     <w:p>
       <w:r>
@@ -733,7 +858,7 @@
 </file>
 
 <file path=word/header1.xml><?xml version="1.0" encoding="utf-8"?>
-<w:hdr xmlns:wpc="http://schemas.microsoft.com/office/word/2010/wordprocessingCanvas" xmlns:cx="http://schemas.microsoft.com/office/drawing/2014/chartex" xmlns:cx1="http://schemas.microsoft.com/office/drawing/2015/9/8/chartex" xmlns:cx2="http://schemas.microsoft.com/office/drawing/2015/10/21/chartex" xmlns:cx3="http://schemas.microsoft.com/office/drawing/2016/5/9/chartex" xmlns:cx4="http://schemas.microsoft.com/office/drawing/2016/5/10/chartex" xmlns:cx5="http://schemas.microsoft.com/office/drawing/2016/5/11/chartex" xmlns:cx6="http://schemas.microsoft.com/office/drawing/2016/5/12/chartex" xmlns:cx7="http://schemas.microsoft.com/office/drawing/2016/5/13/chartex" xmlns:cx8="http://schemas.microsoft.com/office/drawing/2016/5/14/chartex" xmlns:mc="http://schemas.openxmlformats.org/markup-compatibility/2006" xmlns:aink="http://schemas.microsoft.com/office/drawing/2016/ink" xmlns:am3d="http://schemas.microsoft.com/office/drawing/2017/model3d" xmlns:o="urn:schemas-microsoft-com:office:office" xmlns:oel="http://schemas.microsoft.com/office/2019/extlst" xmlns:r="http://schemas.openxmlformats.org/officeDocument/2006/relationships" xmlns:m="http://schemas.openxmlformats.org/officeDocument/2006/math" xmlns:v="urn:schemas-microsoft-com:vml" xmlns:wp14="http://schemas.microsoft.com/office/word/2010/wordprocessingDrawing" xmlns:wp="http://schemas.openxmlformats.org/drawingml/2006/wordprocessingDrawing" xmlns:w10="urn:schemas-microsoft-com:office:word" xmlns:w="http://schemas.openxmlformats.org/wordprocessingml/2006/main" xmlns:w14="http://schemas.microsoft.com/office/word/2010/wordml" xmlns:w15="http://schemas.microsoft.com/office/word/2012/wordml" xmlns:w16cex="http://schemas.microsoft.com/office/word/2018/wordml/cex" xmlns:w16cid="http://schemas.microsoft.com/office/word/2016/wordml/cid" xmlns:w16="http://schemas.microsoft.com/office/word/2018/wordml" xmlns:w16du="http://schemas.microsoft.com/office/word/2023/wordml/word16du" xmlns:w16sdtdh="http://schemas.microsoft.com/office/word/2020/wordml/sdtdatahash" xmlns:w16sdtfl="http://schemas.microsoft.com/office/word/2024/wordml/sdtformatlock" xmlns:w16se="http://schemas.microsoft.com/office/word/2015/wordml/symex" xmlns:wpg="http://schemas.microsoft.com/office/word/2010/wordprocessingGroup" xmlns:wpi="http://schemas.microsoft.com/office/word/2010/wordprocessingInk" xmlns:wne="http://schemas.microsoft.com/office/word/2006/wordml" xmlns:wps="http://schemas.microsoft.com/office/word/2010/wordprocessingShape" mc:Ignorable="w14 w15 w16se w16cid w16 w16cex w16sdtdh w16sdtfl w16du wp14">
+<w:hdr xmlns:wpc="http://schemas.microsoft.com/office/word/2010/wordprocessingCanvas" xmlns:cx="http://schemas.microsoft.com/office/drawing/2014/chartex" xmlns:cx1="http://schemas.microsoft.com/office/drawing/2015/9/8/chartex" xmlns:cx2="http://schemas.microsoft.com/office/drawing/2015/10/21/chartex" xmlns:cx3="http://schemas.microsoft.com/office/drawing/2016/5/9/chartex" xmlns:cx4="http://schemas.microsoft.com/office/drawing/2016/5/10/chartex" xmlns:cx5="http://schemas.microsoft.com/office/drawing/2016/5/11/chartex" xmlns:cx6="http://schemas.microsoft.com/office/drawing/2016/5/12/chartex" xmlns:cx7="http://schemas.microsoft.com/office/drawing/2016/5/13/chartex" xmlns:cx8="http://schemas.microsoft.com/office/drawing/2016/5/14/chartex" xmlns:mc="http://schemas.openxmlformats.org/markup-compatibility/2006" xmlns:m="http://schemas.openxmlformats.org/officeDocument/2006/math" xmlns:aink="http://schemas.microsoft.com/office/drawing/2016/ink" xmlns:am3d="http://schemas.microsoft.com/office/drawing/2017/model3d" xmlns:oel="http://schemas.microsoft.com/office/2019/extlst" xmlns:r="http://schemas.openxmlformats.org/officeDocument/2006/relationships" xmlns:wp14="http://schemas.microsoft.com/office/word/2010/wordprocessingDrawing" xmlns:wp="http://schemas.openxmlformats.org/drawingml/2006/wordprocessingDrawing" xmlns:wpg="http://schemas.microsoft.com/office/word/2010/wordprocessingGroup" xmlns:wpi="http://schemas.microsoft.com/office/word/2010/wordprocessingInk" xmlns:wps="http://schemas.microsoft.com/office/word/2010/wordprocessingShape" xmlns:o="urn:schemas-microsoft-com:office:office" xmlns:v="urn:schemas-microsoft-com:vml" xmlns:w10="urn:schemas-microsoft-com:office:word" xmlns:w="http://schemas.openxmlformats.org/wordprocessingml/2006/main" xmlns:w14="http://schemas.microsoft.com/office/word/2010/wordml" xmlns:w15="http://schemas.microsoft.com/office/word/2012/wordml" xmlns:w16cex="http://schemas.microsoft.com/office/word/2018/wordml/cex" xmlns:w16cid="http://schemas.microsoft.com/office/word/2016/wordml/cid" xmlns:w16="http://schemas.microsoft.com/office/word/2018/wordml" xmlns:w16sdtdh="http://schemas.microsoft.com/office/word/2020/wordml/sdtdatahash" xmlns:w16sdtfl="http://schemas.microsoft.com/office/word/2024/wordml/sdtformatlock" xmlns:w16se="http://schemas.microsoft.com/office/word/2015/wordml/symex" xmlns:w16du="http://schemas.microsoft.com/office/word/2023/wordml/word16du" xmlns:wne="http://schemas.microsoft.com/office/word/2006/wordml" mc:Ignorable="w14 w15 w16se w16cid w16 w16cex w16sdtdh w16sdtfl w16du wp14">
   <w:p>
     <w:pPr>
       <w:pStyle w:val="Header"/>
@@ -743,20 +868,28 @@
 </file>
 
 <file path=word/header2.xml><?xml version="1.0" encoding="utf-8"?>
-<w:hdr xmlns:wpc="http://schemas.microsoft.com/office/word/2010/wordprocessingCanvas" xmlns:cx="http://schemas.microsoft.com/office/drawing/2014/chartex" xmlns:cx1="http://schemas.microsoft.com/office/drawing/2015/9/8/chartex" xmlns:cx2="http://schemas.microsoft.com/office/drawing/2015/10/21/chartex" xmlns:cx3="http://schemas.microsoft.com/office/drawing/2016/5/9/chartex" xmlns:cx4="http://schemas.microsoft.com/office/drawing/2016/5/10/chartex" xmlns:cx5="http://schemas.microsoft.com/office/drawing/2016/5/11/chartex" xmlns:cx6="http://schemas.microsoft.com/office/drawing/2016/5/12/chartex" xmlns:cx7="http://schemas.microsoft.com/office/drawing/2016/5/13/chartex" xmlns:cx8="http://schemas.microsoft.com/office/drawing/2016/5/14/chartex" xmlns:mc="http://schemas.openxmlformats.org/markup-compatibility/2006" xmlns:aink="http://schemas.microsoft.com/office/drawing/2016/ink" xmlns:am3d="http://schemas.microsoft.com/office/drawing/2017/model3d" xmlns:o="urn:schemas-microsoft-com:office:office" xmlns:oel="http://schemas.microsoft.com/office/2019/extlst" xmlns:r="http://schemas.openxmlformats.org/officeDocument/2006/relationships" xmlns:m="http://schemas.openxmlformats.org/officeDocument/2006/math" xmlns:v="urn:schemas-microsoft-com:vml" xmlns:wp14="http://schemas.microsoft.com/office/word/2010/wordprocessingDrawing" xmlns:wp="http://schemas.openxmlformats.org/drawingml/2006/wordprocessingDrawing" xmlns:w10="urn:schemas-microsoft-com:office:word" xmlns:w="http://schemas.openxmlformats.org/wordprocessingml/2006/main" xmlns:w14="http://schemas.microsoft.com/office/word/2010/wordml" xmlns:w15="http://schemas.microsoft.com/office/word/2012/wordml" xmlns:w16cex="http://schemas.microsoft.com/office/word/2018/wordml/cex" xmlns:w16cid="http://schemas.microsoft.com/office/word/2016/wordml/cid" xmlns:w16="http://schemas.microsoft.com/office/word/2018/wordml" xmlns:w16du="http://schemas.microsoft.com/office/word/2023/wordml/word16du" xmlns:w16sdtdh="http://schemas.microsoft.com/office/word/2020/wordml/sdtdatahash" xmlns:w16sdtfl="http://schemas.microsoft.com/office/word/2024/wordml/sdtformatlock" xmlns:w16se="http://schemas.microsoft.com/office/word/2015/wordml/symex" xmlns:wpg="http://schemas.microsoft.com/office/word/2010/wordprocessingGroup" xmlns:wpi="http://schemas.microsoft.com/office/word/2010/wordprocessingInk" xmlns:wne="http://schemas.microsoft.com/office/word/2006/wordml" xmlns:wps="http://schemas.microsoft.com/office/word/2010/wordprocessingShape" mc:Ignorable="w14 w15 w16se w16cid w16 w16cex w16sdtdh w16sdtfl w16du wp14">
+<w:hdr xmlns:wpc="http://schemas.microsoft.com/office/word/2010/wordprocessingCanvas" xmlns:cx="http://schemas.microsoft.com/office/drawing/2014/chartex" xmlns:cx1="http://schemas.microsoft.com/office/drawing/2015/9/8/chartex" xmlns:cx2="http://schemas.microsoft.com/office/drawing/2015/10/21/chartex" xmlns:cx3="http://schemas.microsoft.com/office/drawing/2016/5/9/chartex" xmlns:cx4="http://schemas.microsoft.com/office/drawing/2016/5/10/chartex" xmlns:cx5="http://schemas.microsoft.com/office/drawing/2016/5/11/chartex" xmlns:cx6="http://schemas.microsoft.com/office/drawing/2016/5/12/chartex" xmlns:cx7="http://schemas.microsoft.com/office/drawing/2016/5/13/chartex" xmlns:cx8="http://schemas.microsoft.com/office/drawing/2016/5/14/chartex" xmlns:mc="http://schemas.openxmlformats.org/markup-compatibility/2006" xmlns:m="http://schemas.openxmlformats.org/officeDocument/2006/math" xmlns:aink="http://schemas.microsoft.com/office/drawing/2016/ink" xmlns:am3d="http://schemas.microsoft.com/office/drawing/2017/model3d" xmlns:oel="http://schemas.microsoft.com/office/2019/extlst" xmlns:r="http://schemas.openxmlformats.org/officeDocument/2006/relationships" xmlns:wp14="http://schemas.microsoft.com/office/word/2010/wordprocessingDrawing" xmlns:wp="http://schemas.openxmlformats.org/drawingml/2006/wordprocessingDrawing" xmlns:wpg="http://schemas.microsoft.com/office/word/2010/wordprocessingGroup" xmlns:wpi="http://schemas.microsoft.com/office/word/2010/wordprocessingInk" xmlns:wps="http://schemas.microsoft.com/office/word/2010/wordprocessingShape" xmlns:o="urn:schemas-microsoft-com:office:office" xmlns:v="urn:schemas-microsoft-com:vml" xmlns:w10="urn:schemas-microsoft-com:office:word" xmlns:w="http://schemas.openxmlformats.org/wordprocessingml/2006/main" xmlns:w14="http://schemas.microsoft.com/office/word/2010/wordml" xmlns:w15="http://schemas.microsoft.com/office/word/2012/wordml" xmlns:w16cex="http://schemas.microsoft.com/office/word/2018/wordml/cex" xmlns:w16cid="http://schemas.microsoft.com/office/word/2016/wordml/cid" xmlns:w16="http://schemas.microsoft.com/office/word/2018/wordml" xmlns:w16sdtdh="http://schemas.microsoft.com/office/word/2020/wordml/sdtdatahash" xmlns:w16sdtfl="http://schemas.microsoft.com/office/word/2024/wordml/sdtformatlock" xmlns:w16se="http://schemas.microsoft.com/office/word/2015/wordml/symex" xmlns:w16du="http://schemas.microsoft.com/office/word/2023/wordml/word16du" xmlns:wne="http://schemas.microsoft.com/office/word/2006/wordml" mc:Ignorable="w14 w15 w16se w16cid w16 w16cex w16sdtdh w16sdtfl w16du wp14">
   <w:p>
     <w:pPr>
       <w:pStyle w:val="Header"/>
     </w:pPr>
     <w:r>
-      <w:t>This is a header</w:t>
+      <w:t xml:space="preserve">This </w:t>
+    </w:r>
+    <w:proofErr w:type="spellStart"/>
+    <w:r>
+      <w:t>is</w:t>
+    </w:r>
+    <w:proofErr w:type="spellEnd"/>
+    <w:r>
+      <w:t xml:space="preserve"> a header</w:t>
     </w:r>
   </w:p>
 </w:hdr>
 </file>
 
 <file path=word/header3.xml><?xml version="1.0" encoding="utf-8"?>
-<w:hdr xmlns:wpc="http://schemas.microsoft.com/office/word/2010/wordprocessingCanvas" xmlns:cx="http://schemas.microsoft.com/office/drawing/2014/chartex" xmlns:cx1="http://schemas.microsoft.com/office/drawing/2015/9/8/chartex" xmlns:cx2="http://schemas.microsoft.com/office/drawing/2015/10/21/chartex" xmlns:cx3="http://schemas.microsoft.com/office/drawing/2016/5/9/chartex" xmlns:cx4="http://schemas.microsoft.com/office/drawing/2016/5/10/chartex" xmlns:cx5="http://schemas.microsoft.com/office/drawing/2016/5/11/chartex" xmlns:cx6="http://schemas.microsoft.com/office/drawing/2016/5/12/chartex" xmlns:cx7="http://schemas.microsoft.com/office/drawing/2016/5/13/chartex" xmlns:cx8="http://schemas.microsoft.com/office/drawing/2016/5/14/chartex" xmlns:mc="http://schemas.openxmlformats.org/markup-compatibility/2006" xmlns:aink="http://schemas.microsoft.com/office/drawing/2016/ink" xmlns:am3d="http://schemas.microsoft.com/office/drawing/2017/model3d" xmlns:o="urn:schemas-microsoft-com:office:office" xmlns:oel="http://schemas.microsoft.com/office/2019/extlst" xmlns:r="http://schemas.openxmlformats.org/officeDocument/2006/relationships" xmlns:m="http://schemas.openxmlformats.org/officeDocument/2006/math" xmlns:v="urn:schemas-microsoft-com:vml" xmlns:wp14="http://schemas.microsoft.com/office/word/2010/wordprocessingDrawing" xmlns:wp="http://schemas.openxmlformats.org/drawingml/2006/wordprocessingDrawing" xmlns:w10="urn:schemas-microsoft-com:office:word" xmlns:w="http://schemas.openxmlformats.org/wordprocessingml/2006/main" xmlns:w14="http://schemas.microsoft.com/office/word/2010/wordml" xmlns:w15="http://schemas.microsoft.com/office/word/2012/wordml" xmlns:w16cex="http://schemas.microsoft.com/office/word/2018/wordml/cex" xmlns:w16cid="http://schemas.microsoft.com/office/word/2016/wordml/cid" xmlns:w16="http://schemas.microsoft.com/office/word/2018/wordml" xmlns:w16du="http://schemas.microsoft.com/office/word/2023/wordml/word16du" xmlns:w16sdtdh="http://schemas.microsoft.com/office/word/2020/wordml/sdtdatahash" xmlns:w16sdtfl="http://schemas.microsoft.com/office/word/2024/wordml/sdtformatlock" xmlns:w16se="http://schemas.microsoft.com/office/word/2015/wordml/symex" xmlns:wpg="http://schemas.microsoft.com/office/word/2010/wordprocessingGroup" xmlns:wpi="http://schemas.microsoft.com/office/word/2010/wordprocessingInk" xmlns:wne="http://schemas.microsoft.com/office/word/2006/wordml" xmlns:wps="http://schemas.microsoft.com/office/word/2010/wordprocessingShape" mc:Ignorable="w14 w15 w16se w16cid w16 w16cex w16sdtdh w16sdtfl w16du wp14">
+<w:hdr xmlns:wpc="http://schemas.microsoft.com/office/word/2010/wordprocessingCanvas" xmlns:cx="http://schemas.microsoft.com/office/drawing/2014/chartex" xmlns:cx1="http://schemas.microsoft.com/office/drawing/2015/9/8/chartex" xmlns:cx2="http://schemas.microsoft.com/office/drawing/2015/10/21/chartex" xmlns:cx3="http://schemas.microsoft.com/office/drawing/2016/5/9/chartex" xmlns:cx4="http://schemas.microsoft.com/office/drawing/2016/5/10/chartex" xmlns:cx5="http://schemas.microsoft.com/office/drawing/2016/5/11/chartex" xmlns:cx6="http://schemas.microsoft.com/office/drawing/2016/5/12/chartex" xmlns:cx7="http://schemas.microsoft.com/office/drawing/2016/5/13/chartex" xmlns:cx8="http://schemas.microsoft.com/office/drawing/2016/5/14/chartex" xmlns:mc="http://schemas.openxmlformats.org/markup-compatibility/2006" xmlns:m="http://schemas.openxmlformats.org/officeDocument/2006/math" xmlns:aink="http://schemas.microsoft.com/office/drawing/2016/ink" xmlns:am3d="http://schemas.microsoft.com/office/drawing/2017/model3d" xmlns:oel="http://schemas.microsoft.com/office/2019/extlst" xmlns:r="http://schemas.openxmlformats.org/officeDocument/2006/relationships" xmlns:wp14="http://schemas.microsoft.com/office/word/2010/wordprocessingDrawing" xmlns:wp="http://schemas.openxmlformats.org/drawingml/2006/wordprocessingDrawing" xmlns:wpg="http://schemas.microsoft.com/office/word/2010/wordprocessingGroup" xmlns:wpi="http://schemas.microsoft.com/office/word/2010/wordprocessingInk" xmlns:wps="http://schemas.microsoft.com/office/word/2010/wordprocessingShape" xmlns:o="urn:schemas-microsoft-com:office:office" xmlns:v="urn:schemas-microsoft-com:vml" xmlns:w10="urn:schemas-microsoft-com:office:word" xmlns:w="http://schemas.openxmlformats.org/wordprocessingml/2006/main" xmlns:w14="http://schemas.microsoft.com/office/word/2010/wordml" xmlns:w15="http://schemas.microsoft.com/office/word/2012/wordml" xmlns:w16cex="http://schemas.microsoft.com/office/word/2018/wordml/cex" xmlns:w16cid="http://schemas.microsoft.com/office/word/2016/wordml/cid" xmlns:w16="http://schemas.microsoft.com/office/word/2018/wordml" xmlns:w16sdtdh="http://schemas.microsoft.com/office/word/2020/wordml/sdtdatahash" xmlns:w16sdtfl="http://schemas.microsoft.com/office/word/2024/wordml/sdtformatlock" xmlns:w16se="http://schemas.microsoft.com/office/word/2015/wordml/symex" xmlns:w16du="http://schemas.microsoft.com/office/word/2023/wordml/word16du" xmlns:wne="http://schemas.microsoft.com/office/word/2006/wordml" mc:Ignorable="w14 w15 w16se w16cid w16 w16cex w16sdtdh w16sdtfl w16du wp14">
   <w:p>
     <w:pPr>
       <w:pStyle w:val="Header"/>
@@ -803,7 +936,7 @@
 </file>
 
 <file path=word/numbering.xml><?xml version="1.0" encoding="utf-8"?>
-<w:numbering xmlns:wpc="http://schemas.microsoft.com/office/word/2010/wordprocessingCanvas" xmlns:cx="http://schemas.microsoft.com/office/drawing/2014/chartex" xmlns:cx1="http://schemas.microsoft.com/office/drawing/2015/9/8/chartex" xmlns:cx2="http://schemas.microsoft.com/office/drawing/2015/10/21/chartex" xmlns:cx3="http://schemas.microsoft.com/office/drawing/2016/5/9/chartex" xmlns:cx4="http://schemas.microsoft.com/office/drawing/2016/5/10/chartex" xmlns:cx5="http://schemas.microsoft.com/office/drawing/2016/5/11/chartex" xmlns:cx6="http://schemas.microsoft.com/office/drawing/2016/5/12/chartex" xmlns:cx7="http://schemas.microsoft.com/office/drawing/2016/5/13/chartex" xmlns:cx8="http://schemas.microsoft.com/office/drawing/2016/5/14/chartex" xmlns:mc="http://schemas.openxmlformats.org/markup-compatibility/2006" xmlns:aink="http://schemas.microsoft.com/office/drawing/2016/ink" xmlns:am3d="http://schemas.microsoft.com/office/drawing/2017/model3d" xmlns:o="urn:schemas-microsoft-com:office:office" xmlns:oel="http://schemas.microsoft.com/office/2019/extlst" xmlns:r="http://schemas.openxmlformats.org/officeDocument/2006/relationships" xmlns:m="http://schemas.openxmlformats.org/officeDocument/2006/math" xmlns:v="urn:schemas-microsoft-com:vml" xmlns:wp14="http://schemas.microsoft.com/office/word/2010/wordprocessingDrawing" xmlns:wp="http://schemas.openxmlformats.org/drawingml/2006/wordprocessingDrawing" xmlns:w10="urn:schemas-microsoft-com:office:word" xmlns:w="http://schemas.openxmlformats.org/wordprocessingml/2006/main" xmlns:w14="http://schemas.microsoft.com/office/word/2010/wordml" xmlns:w15="http://schemas.microsoft.com/office/word/2012/wordml" xmlns:w16cex="http://schemas.microsoft.com/office/word/2018/wordml/cex" xmlns:w16cid="http://schemas.microsoft.com/office/word/2016/wordml/cid" xmlns:w16="http://schemas.microsoft.com/office/word/2018/wordml" xmlns:w16du="http://schemas.microsoft.com/office/word/2023/wordml/word16du" xmlns:w16sdtdh="http://schemas.microsoft.com/office/word/2020/wordml/sdtdatahash" xmlns:w16sdtfl="http://schemas.microsoft.com/office/word/2024/wordml/sdtformatlock" xmlns:w16se="http://schemas.microsoft.com/office/word/2015/wordml/symex" xmlns:wpg="http://schemas.microsoft.com/office/word/2010/wordprocessingGroup" xmlns:wpi="http://schemas.microsoft.com/office/word/2010/wordprocessingInk" xmlns:wne="http://schemas.microsoft.com/office/word/2006/wordml" xmlns:wps="http://schemas.microsoft.com/office/word/2010/wordprocessingShape" mc:Ignorable="w14 w15 w16se w16cid w16 w16cex w16sdtdh w16sdtfl w16du wp14">
+<w:numbering xmlns:wpc="http://schemas.microsoft.com/office/word/2010/wordprocessingCanvas" xmlns:cx="http://schemas.microsoft.com/office/drawing/2014/chartex" xmlns:cx1="http://schemas.microsoft.com/office/drawing/2015/9/8/chartex" xmlns:cx2="http://schemas.microsoft.com/office/drawing/2015/10/21/chartex" xmlns:cx3="http://schemas.microsoft.com/office/drawing/2016/5/9/chartex" xmlns:cx4="http://schemas.microsoft.com/office/drawing/2016/5/10/chartex" xmlns:cx5="http://schemas.microsoft.com/office/drawing/2016/5/11/chartex" xmlns:cx6="http://schemas.microsoft.com/office/drawing/2016/5/12/chartex" xmlns:cx7="http://schemas.microsoft.com/office/drawing/2016/5/13/chartex" xmlns:cx8="http://schemas.microsoft.com/office/drawing/2016/5/14/chartex" xmlns:mc="http://schemas.openxmlformats.org/markup-compatibility/2006" xmlns:m="http://schemas.openxmlformats.org/officeDocument/2006/math" xmlns:aink="http://schemas.microsoft.com/office/drawing/2016/ink" xmlns:am3d="http://schemas.microsoft.com/office/drawing/2017/model3d" xmlns:oel="http://schemas.microsoft.com/office/2019/extlst" xmlns:r="http://schemas.openxmlformats.org/officeDocument/2006/relationships" xmlns:wp14="http://schemas.microsoft.com/office/word/2010/wordprocessingDrawing" xmlns:wp="http://schemas.openxmlformats.org/drawingml/2006/wordprocessingDrawing" xmlns:wpg="http://schemas.microsoft.com/office/word/2010/wordprocessingGroup" xmlns:wpi="http://schemas.microsoft.com/office/word/2010/wordprocessingInk" xmlns:wps="http://schemas.microsoft.com/office/word/2010/wordprocessingShape" xmlns:o="urn:schemas-microsoft-com:office:office" xmlns:v="urn:schemas-microsoft-com:vml" xmlns:w10="urn:schemas-microsoft-com:office:word" xmlns:w="http://schemas.openxmlformats.org/wordprocessingml/2006/main" xmlns:w14="http://schemas.microsoft.com/office/word/2010/wordml" xmlns:w15="http://schemas.microsoft.com/office/word/2012/wordml" xmlns:w16cex="http://schemas.microsoft.com/office/word/2018/wordml/cex" xmlns:w16cid="http://schemas.microsoft.com/office/word/2016/wordml/cid" xmlns:w16="http://schemas.microsoft.com/office/word/2018/wordml" xmlns:w16sdtdh="http://schemas.microsoft.com/office/word/2020/wordml/sdtdatahash" xmlns:w16sdtfl="http://schemas.microsoft.com/office/word/2024/wordml/sdtformatlock" xmlns:w16se="http://schemas.microsoft.com/office/word/2015/wordml/symex" xmlns:w16du="http://schemas.microsoft.com/office/word/2023/wordml/word16du" xmlns:wne="http://schemas.microsoft.com/office/word/2006/wordml" mc:Ignorable="w14 w15 w16se w16cid w16 w16cex w16sdtdh w16sdtfl w16du wp14">
   <w:abstractNum w:abstractNumId="0" w15:restartNumberingAfterBreak="0">
     <w:nsid w:val="5AB62F64"/>
     <w:multiLevelType w:val="hybridMultilevel"/>
@@ -924,7 +1057,7 @@
 </file>
 
 <file path=word/styles.xml><?xml version="1.0" encoding="utf-8"?>
-<w:styles xmlns:mc="http://schemas.openxmlformats.org/markup-compatibility/2006" xmlns:r="http://schemas.openxmlformats.org/officeDocument/2006/relationships" xmlns:w="http://schemas.openxmlformats.org/wordprocessingml/2006/main" xmlns:w14="http://schemas.microsoft.com/office/word/2010/wordml" xmlns:w15="http://schemas.microsoft.com/office/word/2012/wordml" xmlns:w16cex="http://schemas.microsoft.com/office/word/2018/wordml/cex" xmlns:w16cid="http://schemas.microsoft.com/office/word/2016/wordml/cid" xmlns:w16="http://schemas.microsoft.com/office/word/2018/wordml" xmlns:w16du="http://schemas.microsoft.com/office/word/2023/wordml/word16du" xmlns:w16sdtdh="http://schemas.microsoft.com/office/word/2020/wordml/sdtdatahash" xmlns:w16sdtfl="http://schemas.microsoft.com/office/word/2024/wordml/sdtformatlock" xmlns:w16se="http://schemas.microsoft.com/office/word/2015/wordml/symex" mc:Ignorable="w14 w15 w16se w16cid w16 w16cex w16sdtdh w16sdtfl w16du">
+<w:styles xmlns:mc="http://schemas.openxmlformats.org/markup-compatibility/2006" xmlns:r="http://schemas.openxmlformats.org/officeDocument/2006/relationships" xmlns:w="http://schemas.openxmlformats.org/wordprocessingml/2006/main" xmlns:w14="http://schemas.microsoft.com/office/word/2010/wordml" xmlns:w15="http://schemas.microsoft.com/office/word/2012/wordml" xmlns:w16cex="http://schemas.microsoft.com/office/word/2018/wordml/cex" xmlns:w16cid="http://schemas.microsoft.com/office/word/2016/wordml/cid" xmlns:w16="http://schemas.microsoft.com/office/word/2018/wordml" xmlns:w16sdtdh="http://schemas.microsoft.com/office/word/2020/wordml/sdtdatahash" xmlns:w16sdtfl="http://schemas.microsoft.com/office/word/2024/wordml/sdtformatlock" xmlns:w16se="http://schemas.microsoft.com/office/word/2015/wordml/symex" xmlns:w16du="http://schemas.microsoft.com/office/word/2023/wordml/word16du" mc:Ignorable="w14 w15 w16se w16cid w16 w16cex w16sdtdh w16sdtfl w16du">
   <w:docDefaults>
     <w:rPrDefault>
       <w:rPr>
@@ -1520,7 +1653,6 @@
   <w:style w:type="character" w:default="1" w:styleId="DefaultParagraphFont">
     <w:name w:val="Default Paragraph Font"/>
     <w:uiPriority w:val="1"/>
-    <w:semiHidden/>
     <w:unhideWhenUsed/>
   </w:style>
   <w:style w:type="table" w:default="1" w:styleId="TableNormal">

</xml_diff>